<commit_message>
Laboratoire : aucun prélèvement après midi (au lieu d'une fermeture à 14 heures)
P20, la grille d'observation de son centre, le code B8, les résultats,
la discussion, le mémo de phase 3, le kit de collecte et la liste à
vérifier disent désormais que le laboratoire ne prélève plus après
12 heures : la femme qui arrive tard repart sans prélèvement.

Co-Authored-By: Claude Opus 5.5 <noreply@anthropic.com>
Claude-Session: https://claude.ai/code/session_01HxwPseJn9EZbm4HRSeCoVh
</commit_message>
<xml_diff>
--- a/memoire-ngoma/livrables/Annexe_1_Entretiens_remplis.docx
+++ b/memoire-ngoma/livrables/Annexe_1_Entretiens_remplis.docx
@@ -40755,7 +40755,7 @@
           <w:sz w:val="20"/>
           <w:szCs w:val="20"/>
         </w:rPr>
-        <w:t xml:space="preserve">La tension, avec ce vieil appareil — regardez, la poire est réparée avec du ruban. Il marche, mais il faut s'y reprendre à deux ou trois fois. Le sucre, c'est pour toutes à la première visite, c'est sur la fiche : je fais le bon et la femme va au laboratoire. Mais le laborantin est seul et il part à quatorze heures. Celle qui arrive tard, ou qui attend trop longtemps chez nous, trouve le laboratoire fermé ; la case du sucre reste vide, et personne ne la rappelle. Et ici, nous n'avons pas de glucomètre pour le remplacer.</w:t>
+        <w:t xml:space="preserve">La tension, avec ce vieil appareil — regardez, la poire est réparée avec du ruban. Il marche, mais il faut s'y reprendre à deux ou trois fois. Le sucre, c'est pour toutes à la première visite, c'est sur la fiche : je fais le bon et la femme va au laboratoire. Mais le laboratoire ne prélève plus après midi. Celle qui arrive tard, ou qui attend trop longtemps chez nous, trouve un laboratoire qui ne reçoit plus personne pour les prélèvements ; la case du sucre reste vide, et personne ne la rappelle. Et ici, nous n'avons pas de glucomètre pour le remplacer.</w:t>
       </w:r>
     </w:p>
     <w:p>
@@ -41727,7 +41727,7 @@
           <w:sz w:val="20"/>
           <w:szCs w:val="20"/>
         </w:rPr>
-        <w:t xml:space="preserve">Pour l'information, au moins, il y a la séance : la même pour toutes, le même jour. Ça, c'est juste. Ce qui n'est pas juste, c'est ce qui se passe après, à la table, et l'après-midi quand le laboratoire est fermé.</w:t>
+        <w:t xml:space="preserve">Pour l'information, au moins, il y a la séance : la même pour toutes, le même jour. Ça, c'est juste. Ce qui n'est pas juste, c'est ce qui se passe après, à la table, et l'après-midi, quand le laboratoire ne prélève plus.</w:t>
       </w:r>
     </w:p>
     <w:p>

</xml_diff>

<commit_message>
Protocole révisé : mémoire, QualiCode et kit alignés
Le protocole a été révisé hors dépôt (suivi des modifications) pour
reporter les décisions déjà intégrées au mémoire et les réalités de
terrain. Le mémoire lit désormais le protocole révisé :
- référence 72 (Mulungi et al.) dans la bibliographie du protocole ;
- annexes 1, 2 et 4 reprises du protocole révisé (relances du guide,
  rubriques A bis et B bis, consentement sans enregistrement) ;
- annexe 7 du protocole non reproduite, pour tenir en 72 pages.
Entretiens notés sans enregistrement : projet QualiCode (en-têtes,
mémo de fidélité des notes, variable d'enregistrement retirée),
registre des consentements, kit de terrain et guide alignés.

Co-Authored-By: Claude Opus 5.5 <noreply@anthropic.com>
Claude-Session: https://claude.ai/code/session_01HxwPseJn9EZbm4HRSeCoVh
</commit_message>
<xml_diff>
--- a/memoire-ngoma/livrables/Annexe_1_Entretiens_remplis.docx
+++ b/memoire-ngoma/livrables/Annexe_1_Entretiens_remplis.docx
@@ -577,7 +577,7 @@
                 <w:sz w:val="19"/>
                 <w:szCs w:val="19"/>
               </w:rPr>
-              <w:t xml:space="preserve">Traitement de la transcription (§ 4.2.6)</w:t>
+              <w:t xml:space="preserve">Traitement des notes (§ 4.2.6)</w:t>
             </w:r>
           </w:p>
         </w:tc>
@@ -726,7 +726,7 @@
                 <w:sz w:val="19"/>
                 <w:szCs w:val="19"/>
               </w:rPr>
-              <w:t xml:space="preserve">Transcription en kinyarwanda, traduction française par le chercheur</w:t>
+              <w:t xml:space="preserve">Notes mises au propre en kinyarwanda, traduction française par le chercheur</w:t>
             </w:r>
           </w:p>
         </w:tc>
@@ -875,7 +875,7 @@
                 <w:sz w:val="19"/>
                 <w:szCs w:val="19"/>
               </w:rPr>
-              <w:t xml:space="preserve">Transcription directe par le chercheur</w:t>
+              <w:t xml:space="preserve">Notes mises au propre par le chercheur</w:t>
             </w:r>
           </w:p>
         </w:tc>
@@ -1024,7 +1024,7 @@
                 <w:sz w:val="19"/>
                 <w:szCs w:val="19"/>
               </w:rPr>
-              <w:t xml:space="preserve">Transcription en kinyarwanda, traduction française par le chercheur</w:t>
+              <w:t xml:space="preserve">Notes mises au propre en kinyarwanda, traduction française par le chercheur</w:t>
             </w:r>
           </w:p>
         </w:tc>
@@ -1173,7 +1173,7 @@
                 <w:sz w:val="19"/>
                 <w:szCs w:val="19"/>
               </w:rPr>
-              <w:t xml:space="preserve">Transcription en kinyarwanda, traduction française par le chercheur</w:t>
+              <w:t xml:space="preserve">Notes mises au propre en kinyarwanda, traduction française par le chercheur</w:t>
             </w:r>
           </w:p>
         </w:tc>
@@ -1322,7 +1322,7 @@
                 <w:sz w:val="19"/>
                 <w:szCs w:val="19"/>
               </w:rPr>
-              <w:t xml:space="preserve">Transcription en kinyarwanda, traduction française par le chercheur</w:t>
+              <w:t xml:space="preserve">Notes mises au propre en kinyarwanda, traduction française par le chercheur</w:t>
             </w:r>
           </w:p>
         </w:tc>
@@ -1471,7 +1471,7 @@
                 <w:sz w:val="19"/>
                 <w:szCs w:val="19"/>
               </w:rPr>
-              <w:t xml:space="preserve">Transcription en kinyarwanda, traduction française par le chercheur</w:t>
+              <w:t xml:space="preserve">Notes mises au propre en kinyarwanda, traduction française par le chercheur</w:t>
             </w:r>
           </w:p>
         </w:tc>
@@ -1620,7 +1620,7 @@
                 <w:sz w:val="19"/>
                 <w:szCs w:val="19"/>
               </w:rPr>
-              <w:t xml:space="preserve">Transcription directe par le chercheur</w:t>
+              <w:t xml:space="preserve">Notes mises au propre par le chercheur</w:t>
             </w:r>
           </w:p>
         </w:tc>
@@ -1769,7 +1769,7 @@
                 <w:sz w:val="19"/>
                 <w:szCs w:val="19"/>
               </w:rPr>
-              <w:t xml:space="preserve">Transcription en kinyarwanda, traduction française par le chercheur</w:t>
+              <w:t xml:space="preserve">Notes mises au propre en kinyarwanda, traduction française par le chercheur</w:t>
             </w:r>
           </w:p>
         </w:tc>
@@ -1918,7 +1918,7 @@
                 <w:sz w:val="19"/>
                 <w:szCs w:val="19"/>
               </w:rPr>
-              <w:t xml:space="preserve">Transcription en kinyarwanda, traduction française par le chercheur</w:t>
+              <w:t xml:space="preserve">Notes mises au propre en kinyarwanda, traduction française par le chercheur</w:t>
             </w:r>
           </w:p>
         </w:tc>
@@ -2067,7 +2067,7 @@
                 <w:sz w:val="19"/>
                 <w:szCs w:val="19"/>
               </w:rPr>
-              <w:t xml:space="preserve">Transcription en kinyarwanda, traduction française par le chercheur</w:t>
+              <w:t xml:space="preserve">Notes mises au propre en kinyarwanda, traduction française par le chercheur</w:t>
             </w:r>
           </w:p>
         </w:tc>
@@ -2216,7 +2216,7 @@
                 <w:sz w:val="19"/>
                 <w:szCs w:val="19"/>
               </w:rPr>
-              <w:t xml:space="preserve">Transcription directe par le chercheur</w:t>
+              <w:t xml:space="preserve">Notes mises au propre par le chercheur</w:t>
             </w:r>
           </w:p>
         </w:tc>
@@ -2365,7 +2365,7 @@
                 <w:sz w:val="19"/>
                 <w:szCs w:val="19"/>
               </w:rPr>
-              <w:t xml:space="preserve">Transcription en kinyarwanda, traduction française par le chercheur</w:t>
+              <w:t xml:space="preserve">Notes mises au propre en kinyarwanda, traduction française par le chercheur</w:t>
             </w:r>
           </w:p>
         </w:tc>
@@ -2514,7 +2514,7 @@
                 <w:sz w:val="19"/>
                 <w:szCs w:val="19"/>
               </w:rPr>
-              <w:t xml:space="preserve">Transcription en kinyarwanda, traduction française par le chercheur</w:t>
+              <w:t xml:space="preserve">Notes mises au propre en kinyarwanda, traduction française par le chercheur</w:t>
             </w:r>
           </w:p>
         </w:tc>
@@ -2663,7 +2663,7 @@
                 <w:sz w:val="19"/>
                 <w:szCs w:val="19"/>
               </w:rPr>
-              <w:t xml:space="preserve">Transcription en kinyarwanda, traduction française par le chercheur</w:t>
+              <w:t xml:space="preserve">Notes mises au propre en kinyarwanda, traduction française par le chercheur</w:t>
             </w:r>
           </w:p>
         </w:tc>
@@ -2812,7 +2812,7 @@
                 <w:sz w:val="19"/>
                 <w:szCs w:val="19"/>
               </w:rPr>
-              <w:t xml:space="preserve">Transcription en kinyarwanda, traduction française par le chercheur</w:t>
+              <w:t xml:space="preserve">Notes mises au propre en kinyarwanda, traduction française par le chercheur</w:t>
             </w:r>
           </w:p>
         </w:tc>
@@ -2961,7 +2961,7 @@
                 <w:sz w:val="19"/>
                 <w:szCs w:val="19"/>
               </w:rPr>
-              <w:t xml:space="preserve">Transcription en kinyarwanda, traduction française par le chercheur</w:t>
+              <w:t xml:space="preserve">Notes mises au propre en kinyarwanda, traduction française par le chercheur</w:t>
             </w:r>
           </w:p>
         </w:tc>
@@ -3110,7 +3110,7 @@
                 <w:sz w:val="19"/>
                 <w:szCs w:val="19"/>
               </w:rPr>
-              <w:t xml:space="preserve">Transcription en kinyarwanda, traduction française par le chercheur</w:t>
+              <w:t xml:space="preserve">Notes mises au propre en kinyarwanda, traduction française par le chercheur</w:t>
             </w:r>
           </w:p>
         </w:tc>
@@ -3259,7 +3259,7 @@
                 <w:sz w:val="19"/>
                 <w:szCs w:val="19"/>
               </w:rPr>
-              <w:t xml:space="preserve">Transcription en kinyarwanda, traduction française par le chercheur</w:t>
+              <w:t xml:space="preserve">Notes mises au propre en kinyarwanda, traduction française par le chercheur</w:t>
             </w:r>
           </w:p>
         </w:tc>
@@ -3408,7 +3408,7 @@
                 <w:sz w:val="19"/>
                 <w:szCs w:val="19"/>
               </w:rPr>
-              <w:t xml:space="preserve">Transcription directe par le chercheur</w:t>
+              <w:t xml:space="preserve">Notes mises au propre par le chercheur</w:t>
             </w:r>
           </w:p>
         </w:tc>
@@ -3557,7 +3557,7 @@
                 <w:sz w:val="19"/>
                 <w:szCs w:val="19"/>
               </w:rPr>
-              <w:t xml:space="preserve">Transcription en kinyarwanda, traduction française par le chercheur</w:t>
+              <w:t xml:space="preserve">Notes mises au propre en kinyarwanda, traduction française par le chercheur</w:t>
             </w:r>
           </w:p>
         </w:tc>
@@ -3605,7 +3605,7 @@
           <w:sz w:val="20"/>
           <w:szCs w:val="20"/>
         </w:rPr>
-        <w:t xml:space="preserve">Les termes placés entre crochets dans les transcriptions (par exemple [umuvuduko w'amaraso], [kugagara], [ubukene]) sont ILLUSTRATIFS. Ils montrent où et comment le protocole demande de conserver les termes propres au discours du participant — ils ne constituent pas une traduction vérifiée. Avant tout usage, faites-les relire par un locuteur natif, et notamment par le collaborateur trilingue prévu au § 4.2.6 pour la transcription.</w:t>
+        <w:t xml:space="preserve">Les termes placés entre crochets dans les notes d'entretien (par exemple [umuvuduko w'amaraso], [kugagara], [ubukene]) sont ILLUSTRATIFS. Ils montrent où et comment le protocole demande de conserver les termes propres au discours du participant — ils ne constituent pas une traduction vérifiée. Avant tout usage, faites-les relire par un locuteur natif, et notamment par la personne bilingue chargée de la vérification des traductions (§ 4.2.6).</w:t>
       </w:r>
     </w:p>
     <w:p/>

</xml_diff>